<commit_message>
cap nhap lai bao cao week1
</commit_message>
<xml_diff>
--- a/Week01/Week01_BaoCaoNhom.docx
+++ b/Week01/Week01_BaoCaoNhom.docx
@@ -123,12 +123,6 @@
         <w:gridCol w:w="6026"/>
       </w:tblGrid>
       <w:tr>
-        <w:tblPrEx>
-          <w:tblCellMar>
-            <w:top w:w="0" w:type="dxa"/>
-            <w:bottom w:w="0" w:type="dxa"/>
-          </w:tblCellMar>
-        </w:tblPrEx>
         <w:tc>
           <w:tcPr>
             <w:tcW w:w="3000" w:type="dxa"/>
@@ -201,12 +195,6 @@
         </w:tc>
       </w:tr>
       <w:tr>
-        <w:tblPrEx>
-          <w:tblCellMar>
-            <w:top w:w="0" w:type="dxa"/>
-            <w:bottom w:w="0" w:type="dxa"/>
-          </w:tblCellMar>
-        </w:tblPrEx>
         <w:tc>
           <w:tcPr>
             <w:tcW w:w="3000" w:type="dxa"/>
@@ -269,12 +257,6 @@
         </w:tc>
       </w:tr>
       <w:tr>
-        <w:tblPrEx>
-          <w:tblCellMar>
-            <w:top w:w="0" w:type="dxa"/>
-            <w:bottom w:w="0" w:type="dxa"/>
-          </w:tblCellMar>
-        </w:tblPrEx>
         <w:tc>
           <w:tcPr>
             <w:tcW w:w="3000" w:type="dxa"/>
@@ -337,12 +319,6 @@
         </w:tc>
       </w:tr>
       <w:tr>
-        <w:tblPrEx>
-          <w:tblCellMar>
-            <w:top w:w="0" w:type="dxa"/>
-            <w:bottom w:w="0" w:type="dxa"/>
-          </w:tblCellMar>
-        </w:tblPrEx>
         <w:tc>
           <w:tcPr>
             <w:tcW w:w="3000" w:type="dxa"/>
@@ -399,12 +375,6 @@
         </w:tc>
       </w:tr>
       <w:tr>
-        <w:tblPrEx>
-          <w:tblCellMar>
-            <w:top w:w="0" w:type="dxa"/>
-            <w:bottom w:w="0" w:type="dxa"/>
-          </w:tblCellMar>
-        </w:tblPrEx>
         <w:tc>
           <w:tcPr>
             <w:tcW w:w="3000" w:type="dxa"/>
@@ -461,12 +431,6 @@
         </w:tc>
       </w:tr>
       <w:tr>
-        <w:tblPrEx>
-          <w:tblCellMar>
-            <w:top w:w="0" w:type="dxa"/>
-            <w:bottom w:w="0" w:type="dxa"/>
-          </w:tblCellMar>
-        </w:tblPrEx>
         <w:tc>
           <w:tcPr>
             <w:tcW w:w="3000" w:type="dxa"/>
@@ -594,12 +558,6 @@
         <w:gridCol w:w="1472"/>
       </w:tblGrid>
       <w:tr>
-        <w:tblPrEx>
-          <w:tblCellMar>
-            <w:top w:w="0" w:type="dxa"/>
-            <w:bottom w:w="0" w:type="dxa"/>
-          </w:tblCellMar>
-        </w:tblPrEx>
         <w:tc>
           <w:tcPr>
             <w:tcW w:w="694" w:type="dxa"/>
@@ -767,12 +725,6 @@
         </w:tc>
       </w:tr>
       <w:tr>
-        <w:tblPrEx>
-          <w:tblCellMar>
-            <w:top w:w="0" w:type="dxa"/>
-            <w:bottom w:w="0" w:type="dxa"/>
-          </w:tblCellMar>
-        </w:tblPrEx>
         <w:tc>
           <w:tcPr>
             <w:tcW w:w="694" w:type="dxa"/>
@@ -924,12 +876,6 @@
         </w:tc>
       </w:tr>
       <w:tr>
-        <w:tblPrEx>
-          <w:tblCellMar>
-            <w:top w:w="0" w:type="dxa"/>
-            <w:bottom w:w="0" w:type="dxa"/>
-          </w:tblCellMar>
-        </w:tblPrEx>
         <w:tc>
           <w:tcPr>
             <w:tcW w:w="694" w:type="dxa"/>
@@ -1073,12 +1019,6 @@
         </w:tc>
       </w:tr>
       <w:tr>
-        <w:tblPrEx>
-          <w:tblCellMar>
-            <w:top w:w="0" w:type="dxa"/>
-            <w:bottom w:w="0" w:type="dxa"/>
-          </w:tblCellMar>
-        </w:tblPrEx>
         <w:tc>
           <w:tcPr>
             <w:tcW w:w="694" w:type="dxa"/>
@@ -1223,12 +1163,6 @@
         </w:tc>
       </w:tr>
       <w:tr>
-        <w:tblPrEx>
-          <w:tblCellMar>
-            <w:top w:w="0" w:type="dxa"/>
-            <w:bottom w:w="0" w:type="dxa"/>
-          </w:tblCellMar>
-        </w:tblPrEx>
         <w:tc>
           <w:tcPr>
             <w:tcW w:w="694" w:type="dxa"/>
@@ -1399,12 +1333,6 @@
         <w:gridCol w:w="4513"/>
       </w:tblGrid>
       <w:tr>
-        <w:tblPrEx>
-          <w:tblCellMar>
-            <w:top w:w="0" w:type="dxa"/>
-            <w:bottom w:w="0" w:type="dxa"/>
-          </w:tblCellMar>
-        </w:tblPrEx>
         <w:tc>
           <w:tcPr>
             <w:tcW w:w="4513" w:type="dxa"/>
@@ -1461,12 +1389,6 @@
         </w:tc>
       </w:tr>
       <w:tr>
-        <w:tblPrEx>
-          <w:tblCellMar>
-            <w:top w:w="0" w:type="dxa"/>
-            <w:bottom w:w="0" w:type="dxa"/>
-          </w:tblCellMar>
-        </w:tblPrEx>
         <w:tc>
           <w:tcPr>
             <w:tcW w:w="4513" w:type="dxa"/>
@@ -1604,12 +1526,6 @@
         <w:gridCol w:w="1474"/>
       </w:tblGrid>
       <w:tr>
-        <w:tblPrEx>
-          <w:tblCellMar>
-            <w:top w:w="0" w:type="dxa"/>
-            <w:bottom w:w="0" w:type="dxa"/>
-          </w:tblCellMar>
-        </w:tblPrEx>
         <w:tc>
           <w:tcPr>
             <w:tcW w:w="400" w:type="dxa"/>
@@ -1744,12 +1660,6 @@
         </w:tc>
       </w:tr>
       <w:tr>
-        <w:tblPrEx>
-          <w:tblCellMar>
-            <w:top w:w="0" w:type="dxa"/>
-            <w:bottom w:w="0" w:type="dxa"/>
-          </w:tblCellMar>
-        </w:tblPrEx>
         <w:tc>
           <w:tcPr>
             <w:tcW w:w="400" w:type="dxa"/>
@@ -1887,12 +1797,6 @@
         </w:tc>
       </w:tr>
       <w:tr>
-        <w:tblPrEx>
-          <w:tblCellMar>
-            <w:top w:w="0" w:type="dxa"/>
-            <w:bottom w:w="0" w:type="dxa"/>
-          </w:tblCellMar>
-        </w:tblPrEx>
         <w:tc>
           <w:tcPr>
             <w:tcW w:w="400" w:type="dxa"/>
@@ -2030,12 +1934,6 @@
         </w:tc>
       </w:tr>
       <w:tr>
-        <w:tblPrEx>
-          <w:tblCellMar>
-            <w:top w:w="0" w:type="dxa"/>
-            <w:bottom w:w="0" w:type="dxa"/>
-          </w:tblCellMar>
-        </w:tblPrEx>
         <w:tc>
           <w:tcPr>
             <w:tcW w:w="400" w:type="dxa"/>
@@ -2179,12 +2077,6 @@
         </w:tc>
       </w:tr>
       <w:tr>
-        <w:tblPrEx>
-          <w:tblCellMar>
-            <w:top w:w="0" w:type="dxa"/>
-            <w:bottom w:w="0" w:type="dxa"/>
-          </w:tblCellMar>
-        </w:tblPrEx>
         <w:tc>
           <w:tcPr>
             <w:tcW w:w="400" w:type="dxa"/>
@@ -2323,12 +2215,6 @@
         </w:tc>
       </w:tr>
       <w:tr>
-        <w:tblPrEx>
-          <w:tblCellMar>
-            <w:top w:w="0" w:type="dxa"/>
-            <w:bottom w:w="0" w:type="dxa"/>
-          </w:tblCellMar>
-        </w:tblPrEx>
         <w:tc>
           <w:tcPr>
             <w:tcW w:w="400" w:type="dxa"/>
@@ -2468,12 +2354,6 @@
         </w:tc>
       </w:tr>
       <w:tr>
-        <w:tblPrEx>
-          <w:tblCellMar>
-            <w:top w:w="0" w:type="dxa"/>
-            <w:bottom w:w="0" w:type="dxa"/>
-          </w:tblCellMar>
-        </w:tblPrEx>
         <w:tc>
           <w:tcPr>
             <w:tcW w:w="400" w:type="dxa"/>
@@ -2605,14 +2485,7 @@
                 <w:sz w:val="24"/>
                 <w:szCs w:val="24"/>
               </w:rPr>
-              <w:t>Nguyễn Kim Anh Duy</w:t>
-            </w:r>
-            <w:r>
-              <w:rPr>
-                <w:sz w:val="24"/>
-                <w:szCs w:val="24"/>
-              </w:rPr>
-              <w:t>.Nguyễn Văn Đức</w:t>
+              <w:t>Nguyễn Kim Anh Duy.Nguyễn Văn Đức</w:t>
             </w:r>
           </w:p>
         </w:tc>
@@ -2715,9 +2588,17 @@
           <w:numId w:val="2"/>
         </w:numPr>
         <w:spacing w:before="40" w:after="40"/>
+        <w:rPr>
+          <w:rFonts w:asciiTheme="majorHAnsi" w:hAnsiTheme="majorHAnsi" w:cstheme="majorHAnsi"/>
+        </w:rPr>
       </w:pPr>
       <w:r>
-        <w:t>[Kết quả 1: mô tả cụ thể — thêm link file/commit làm dẫn chứng]</w:t>
+        <w:rPr>
+          <w:rFonts w:asciiTheme="majorHAnsi" w:hAnsiTheme="majorHAnsi" w:cstheme="majorHAnsi"/>
+          <w:sz w:val="24"/>
+          <w:szCs w:val="24"/>
+        </w:rPr>
+        <w:t>Kết quả 1 — Cấu trúc dự án Vite hoàn chỉnh: Khởi tạo thành công mã nguồn tại root directory, tích hợp sẵn Bootstrap CSS và các thư mục phân vùng chức năng sẵn sàng cho việc lập trình code giao diện ở tuần sau</w:t>
       </w:r>
     </w:p>
     <w:p>
@@ -2728,9 +2609,15 @@
           <w:numId w:val="2"/>
         </w:numPr>
         <w:spacing w:before="40" w:after="40"/>
+        <w:rPr>
+          <w:rFonts w:asciiTheme="majorHAnsi" w:hAnsiTheme="majorHAnsi" w:cstheme="majorHAnsi"/>
+        </w:rPr>
       </w:pPr>
       <w:r>
-        <w:t>[Kết quả 2: mô tả cụ thể — thêm link file/commit làm dẫn chứng]</w:t>
+        <w:rPr>
+          <w:rFonts w:asciiTheme="majorHAnsi" w:hAnsiTheme="majorHAnsi" w:cstheme="majorHAnsi"/>
+        </w:rPr>
+        <w:t>Kết quả 2 — File dữ liệu mock cơ sở dữ liệu (db.json): Xây dựng thành công mảng specialties gồm 5 chuyên khoa chính và mảng doctors gồm 8 bác sĩ mẫu với các trường thông tin y khoa chi tiết, kết nối thử nghiệm mượt mà qua json-server.</w:t>
       </w:r>
     </w:p>
     <w:p>
@@ -2741,9 +2628,15 @@
           <w:numId w:val="2"/>
         </w:numPr>
         <w:spacing w:before="40" w:after="40"/>
+        <w:rPr>
+          <w:rFonts w:asciiTheme="majorHAnsi" w:hAnsiTheme="majorHAnsi" w:cstheme="majorHAnsi"/>
+        </w:rPr>
       </w:pPr>
       <w:r>
-        <w:t>[Kết quả 3: mô tả cụ thể — thêm link file/commit làm dẫn chứng]</w:t>
+        <w:rPr>
+          <w:rFonts w:asciiTheme="majorHAnsi" w:hAnsiTheme="majorHAnsi" w:cstheme="majorHAnsi"/>
+        </w:rPr>
+        <w:t>Kết quả 3 — Hồ sơ thiết kế Mockup &amp; Nhật ký Prompt: Hoàn thiện bộ ảnh giao diện 4 màn hình trực quan có dán nhãn component rõ ràng, kèm theo file tài liệu prompts.md ghi lại hành trình tinh chỉnh câu lệnh với AI.</w:t>
       </w:r>
     </w:p>
     <w:p>
@@ -2756,6 +2649,7 @@
         <w:pStyle w:val="Heading2"/>
       </w:pPr>
       <w:r>
+        <w:lastRenderedPageBreak/>
         <w:t>4.2. Screenshot / Demo kết quả</w:t>
       </w:r>
     </w:p>
@@ -2799,12 +2693,6 @@
         <w:gridCol w:w="4526"/>
       </w:tblGrid>
       <w:tr>
-        <w:tblPrEx>
-          <w:tblCellMar>
-            <w:top w:w="0" w:type="dxa"/>
-            <w:bottom w:w="0" w:type="dxa"/>
-          </w:tblCellMar>
-        </w:tblPrEx>
         <w:tc>
           <w:tcPr>
             <w:tcW w:w="4500" w:type="dxa"/>
@@ -2835,48 +2723,8 @@
                 <w:sz w:val="22"/>
                 <w:szCs w:val="22"/>
               </w:rPr>
-              <w:lastRenderedPageBreak/>
-              <w:t>[Chèn Screenshot 1 tại đây]</w:t>
-            </w:r>
-          </w:p>
-          <w:p>
-            <w:pPr>
-              <w:spacing w:before="1200" w:after="80"/>
-              <w:jc w:val="center"/>
-            </w:pPr>
-            <w:r>
-              <w:rPr>
-                <w:i/>
-                <w:iCs/>
-                <w:sz w:val="22"/>
-                <w:szCs w:val="22"/>
-              </w:rPr>
-              <w:t>Hình 1: [Mô tả ngắn]</w:t>
-            </w:r>
-          </w:p>
-        </w:tc>
-        <w:tc>
-          <w:tcPr>
-            <w:tcW w:w="4526" w:type="dxa"/>
-            <w:tcBorders>
-              <w:top w:val="single" w:sz="1" w:space="0" w:color="AAB7C4"/>
-              <w:left w:val="single" w:sz="1" w:space="0" w:color="AAB7C4"/>
-              <w:bottom w:val="single" w:sz="1" w:space="0" w:color="AAB7C4"/>
-              <w:right w:val="single" w:sz="1" w:space="0" w:color="AAB7C4"/>
-            </w:tcBorders>
-            <w:shd w:val="clear" w:color="auto" w:fill="F4F6F8"/>
-            <w:tcMar>
-              <w:top w:w="80" w:type="dxa"/>
-              <w:left w:w="120" w:type="dxa"/>
-              <w:bottom w:w="80" w:type="dxa"/>
-              <w:right w:w="120" w:type="dxa"/>
-            </w:tcMar>
-          </w:tcPr>
-          <w:p>
-            <w:pPr>
-              <w:spacing w:before="1200"/>
-              <w:jc w:val="center"/>
-            </w:pPr>
+              <w:t>[Chèn Screens</w:t>
+            </w:r>
             <w:r>
               <w:rPr>
                 <w:i/>
@@ -2885,6 +2733,101 @@
                 <w:sz w:val="22"/>
                 <w:szCs w:val="22"/>
               </w:rPr>
+              <w:drawing>
+                <wp:inline distT="0" distB="0" distL="0" distR="0" wp14:anchorId="21672724" wp14:editId="0D555AEF">
+                  <wp:extent cx="1585097" cy="6607113"/>
+                  <wp:effectExtent l="0" t="0" r="0" b="3810"/>
+                  <wp:docPr id="288224402" name="Picture 1"/>
+                  <wp:cNvGraphicFramePr>
+                    <a:graphicFrameLocks xmlns:a="http://schemas.openxmlformats.org/drawingml/2006/main" noChangeAspect="1"/>
+                  </wp:cNvGraphicFramePr>
+                  <a:graphic xmlns:a="http://schemas.openxmlformats.org/drawingml/2006/main">
+                    <a:graphicData uri="http://schemas.openxmlformats.org/drawingml/2006/picture">
+                      <pic:pic xmlns:pic="http://schemas.openxmlformats.org/drawingml/2006/picture">
+                        <pic:nvPicPr>
+                          <pic:cNvPr id="288224402" name=""/>
+                          <pic:cNvPicPr/>
+                        </pic:nvPicPr>
+                        <pic:blipFill>
+                          <a:blip r:embed="rId7"/>
+                          <a:stretch>
+                            <a:fillRect/>
+                          </a:stretch>
+                        </pic:blipFill>
+                        <pic:spPr>
+                          <a:xfrm>
+                            <a:off x="0" y="0"/>
+                            <a:ext cx="1585097" cy="6607113"/>
+                          </a:xfrm>
+                          <a:prstGeom prst="rect">
+                            <a:avLst/>
+                          </a:prstGeom>
+                        </pic:spPr>
+                      </pic:pic>
+                    </a:graphicData>
+                  </a:graphic>
+                </wp:inline>
+              </w:drawing>
+            </w:r>
+            <w:r>
+              <w:rPr>
+                <w:i/>
+                <w:iCs/>
+                <w:color w:val="AAB7C4"/>
+                <w:sz w:val="22"/>
+                <w:szCs w:val="22"/>
+              </w:rPr>
+              <w:t>hot 1 tại đây]</w:t>
+            </w:r>
+          </w:p>
+          <w:p>
+            <w:pPr>
+              <w:spacing w:before="1200" w:after="80"/>
+              <w:jc w:val="center"/>
+            </w:pPr>
+            <w:r>
+              <w:rPr>
+                <w:i/>
+                <w:iCs/>
+                <w:sz w:val="22"/>
+                <w:szCs w:val="22"/>
+              </w:rPr>
+              <w:lastRenderedPageBreak/>
+              <w:t>Hình 1: [Mô tả ngắn]</w:t>
+            </w:r>
+          </w:p>
+        </w:tc>
+        <w:tc>
+          <w:tcPr>
+            <w:tcW w:w="4526" w:type="dxa"/>
+            <w:tcBorders>
+              <w:top w:val="single" w:sz="1" w:space="0" w:color="AAB7C4"/>
+              <w:left w:val="single" w:sz="1" w:space="0" w:color="AAB7C4"/>
+              <w:bottom w:val="single" w:sz="1" w:space="0" w:color="AAB7C4"/>
+              <w:right w:val="single" w:sz="1" w:space="0" w:color="AAB7C4"/>
+            </w:tcBorders>
+            <w:shd w:val="clear" w:color="auto" w:fill="F4F6F8"/>
+            <w:tcMar>
+              <w:top w:w="80" w:type="dxa"/>
+              <w:left w:w="120" w:type="dxa"/>
+              <w:bottom w:w="80" w:type="dxa"/>
+              <w:right w:w="120" w:type="dxa"/>
+            </w:tcMar>
+          </w:tcPr>
+          <w:p>
+            <w:pPr>
+              <w:spacing w:before="1200"/>
+              <w:jc w:val="center"/>
+            </w:pPr>
+            <w:r>
+              <w:rPr>
+                <w:i/>
+                <w:iCs/>
+                <w:color w:val="AAB7C4"/>
+                <w:sz w:val="22"/>
+                <w:szCs w:val="22"/>
+              </w:rPr>
+              <w:lastRenderedPageBreak/>
               <w:t>[Chèn Screenshot 2 tại đây]</w:t>
             </w:r>
           </w:p>
@@ -2960,19 +2903,13 @@
         <w:tblLook w:val="04A0" w:firstRow="1" w:lastRow="0" w:firstColumn="1" w:lastColumn="0" w:noHBand="0" w:noVBand="1"/>
       </w:tblPr>
       <w:tblGrid>
-        <w:gridCol w:w="382"/>
-        <w:gridCol w:w="2705"/>
-        <w:gridCol w:w="959"/>
+        <w:gridCol w:w="376"/>
+        <w:gridCol w:w="2437"/>
+        <w:gridCol w:w="934"/>
         <w:gridCol w:w="3820"/>
-        <w:gridCol w:w="1160"/>
+        <w:gridCol w:w="1459"/>
       </w:tblGrid>
       <w:tr>
-        <w:tblPrEx>
-          <w:tblCellMar>
-            <w:top w:w="0" w:type="dxa"/>
-            <w:bottom w:w="0" w:type="dxa"/>
-          </w:tblCellMar>
-        </w:tblPrEx>
         <w:tc>
           <w:tcPr>
             <w:tcW w:w="400" w:type="dxa"/>
@@ -3140,12 +3077,6 @@
         </w:tc>
       </w:tr>
       <w:tr>
-        <w:tblPrEx>
-          <w:tblCellMar>
-            <w:top w:w="0" w:type="dxa"/>
-            <w:bottom w:w="0" w:type="dxa"/>
-          </w:tblCellMar>
-        </w:tblPrEx>
         <w:tc>
           <w:tcPr>
             <w:tcW w:w="400" w:type="dxa"/>
@@ -3231,7 +3162,26 @@
                 <w:sz w:val="24"/>
                 <w:szCs w:val="24"/>
               </w:rPr>
-              <w:t>[ ]</w:t>
+              <w:t>[</w:t>
+            </w:r>
+            <w:r>
+              <w:rPr>
+                <w:rFonts w:ascii="Courier New" w:eastAsia="Courier New" w:hAnsi="Courier New" w:cs="Courier New"/>
+                <w:color w:val="27AE60"/>
+                <w:sz w:val="24"/>
+                <w:szCs w:val="24"/>
+                <w:lang w:val="en-US"/>
+              </w:rPr>
+              <w:t>x</w:t>
+            </w:r>
+            <w:r>
+              <w:rPr>
+                <w:rFonts w:ascii="Courier New" w:eastAsia="Courier New" w:hAnsi="Courier New" w:cs="Courier New"/>
+                <w:color w:val="27AE60"/>
+                <w:sz w:val="24"/>
+                <w:szCs w:val="24"/>
+              </w:rPr>
+              <w:t xml:space="preserve"> ]</w:t>
             </w:r>
           </w:p>
         </w:tc>
@@ -3285,18 +3235,12 @@
                 <w:sz w:val="24"/>
                 <w:szCs w:val="24"/>
               </w:rPr>
-              <w:t>[...]</w:t>
+              <w:t>Đạt chuẩn cấu trúc y khoa</w:t>
             </w:r>
           </w:p>
         </w:tc>
       </w:tr>
       <w:tr>
-        <w:tblPrEx>
-          <w:tblCellMar>
-            <w:top w:w="0" w:type="dxa"/>
-            <w:bottom w:w="0" w:type="dxa"/>
-          </w:tblCellMar>
-        </w:tblPrEx>
         <w:tc>
           <w:tcPr>
             <w:tcW w:w="400" w:type="dxa"/>
@@ -3436,18 +3380,12 @@
                 <w:sz w:val="24"/>
                 <w:szCs w:val="24"/>
               </w:rPr>
-              <w:t>[...]</w:t>
+              <w:t>Lưu đủ prompt đạt và lỗi</w:t>
             </w:r>
           </w:p>
         </w:tc>
       </w:tr>
       <w:tr>
-        <w:tblPrEx>
-          <w:tblCellMar>
-            <w:top w:w="0" w:type="dxa"/>
-            <w:bottom w:w="0" w:type="dxa"/>
-          </w:tblCellMar>
-        </w:tblPrEx>
         <w:tc>
           <w:tcPr>
             <w:tcW w:w="400" w:type="dxa"/>
@@ -3587,18 +3525,12 @@
                 <w:sz w:val="24"/>
                 <w:szCs w:val="24"/>
               </w:rPr>
-              <w:t>[...]</w:t>
+              <w:t>Bảng map UI sang Component</w:t>
             </w:r>
           </w:p>
         </w:tc>
       </w:tr>
       <w:tr>
-        <w:tblPrEx>
-          <w:tblCellMar>
-            <w:top w:w="0" w:type="dxa"/>
-            <w:bottom w:w="0" w:type="dxa"/>
-          </w:tblCellMar>
-        </w:tblPrEx>
         <w:tc>
           <w:tcPr>
             <w:tcW w:w="400" w:type="dxa"/>
@@ -3738,18 +3670,12 @@
                 <w:sz w:val="24"/>
                 <w:szCs w:val="24"/>
               </w:rPr>
-              <w:t>[...]</w:t>
+              <w:t>Môi trường sạch, không lỗi</w:t>
             </w:r>
           </w:p>
         </w:tc>
       </w:tr>
       <w:tr>
-        <w:tblPrEx>
-          <w:tblCellMar>
-            <w:top w:w="0" w:type="dxa"/>
-            <w:bottom w:w="0" w:type="dxa"/>
-          </w:tblCellMar>
-        </w:tblPrEx>
         <w:tc>
           <w:tcPr>
             <w:tcW w:w="400" w:type="dxa"/>
@@ -3857,14 +3783,21 @@
             </w:tcMar>
           </w:tcPr>
           <w:p>
-            <w:r>
-              <w:rPr>
-                <w:sz w:val="24"/>
-                <w:szCs w:val="24"/>
-              </w:rPr>
-              <w:t>docs/component-tree.png hoặc link Figma</w:t>
-            </w:r>
-          </w:p>
+            <w:pPr>
+              <w:rPr>
+                <w:sz w:val="24"/>
+                <w:szCs w:val="24"/>
+              </w:rPr>
+            </w:pPr>
+            <w:r>
+              <w:rPr>
+                <w:sz w:val="24"/>
+                <w:szCs w:val="24"/>
+              </w:rPr>
+              <w:t>docs/component-tree.png</w:t>
+            </w:r>
+          </w:p>
+          <w:p/>
         </w:tc>
         <w:tc>
           <w:tcPr>
@@ -3889,18 +3822,12 @@
                 <w:sz w:val="24"/>
                 <w:szCs w:val="24"/>
               </w:rPr>
-              <w:t>[...]</w:t>
+              <w:t>Phân rõ Page và Component</w:t>
             </w:r>
           </w:p>
         </w:tc>
       </w:tr>
       <w:tr>
-        <w:tblPrEx>
-          <w:tblCellMar>
-            <w:top w:w="0" w:type="dxa"/>
-            <w:bottom w:w="0" w:type="dxa"/>
-          </w:tblCellMar>
-        </w:tblPrEx>
         <w:tc>
           <w:tcPr>
             <w:tcW w:w="400" w:type="dxa"/>
@@ -4090,12 +4017,6 @@
         <w:gridCol w:w="2000"/>
       </w:tblGrid>
       <w:tr>
-        <w:tblPrEx>
-          <w:tblCellMar>
-            <w:top w:w="0" w:type="dxa"/>
-            <w:bottom w:w="0" w:type="dxa"/>
-          </w:tblCellMar>
-        </w:tblPrEx>
         <w:tc>
           <w:tcPr>
             <w:tcW w:w="400" w:type="dxa"/>
@@ -4125,7 +4046,6 @@
                 <w:sz w:val="24"/>
                 <w:szCs w:val="24"/>
               </w:rPr>
-              <w:lastRenderedPageBreak/>
               <w:t>#</w:t>
             </w:r>
           </w:p>
@@ -4264,12 +4184,6 @@
         </w:tc>
       </w:tr>
       <w:tr>
-        <w:tblPrEx>
-          <w:tblCellMar>
-            <w:top w:w="0" w:type="dxa"/>
-            <w:bottom w:w="0" w:type="dxa"/>
-          </w:tblCellMar>
-        </w:tblPrEx>
         <w:tc>
           <w:tcPr>
             <w:tcW w:w="400" w:type="dxa"/>
@@ -4293,6 +4207,7 @@
                 <w:sz w:val="24"/>
                 <w:szCs w:val="24"/>
               </w:rPr>
+              <w:lastRenderedPageBreak/>
               <w:t>1</w:t>
             </w:r>
           </w:p>
@@ -4316,11 +4231,7 @@
           </w:tcPr>
           <w:p>
             <w:r>
-              <w:rPr>
-                <w:sz w:val="24"/>
-                <w:szCs w:val="24"/>
-              </w:rPr>
-              <w:t>[Mô tả lỗi cụ thể]</w:t>
+              <w:t>AI Design Tools sinh layout quá phức tạp, có nhiều hiệu ứng chuyển động vượt scope môn học.</w:t>
             </w:r>
           </w:p>
         </w:tc>
@@ -4347,7 +4258,7 @@
                 <w:sz w:val="24"/>
                 <w:szCs w:val="24"/>
               </w:rPr>
-              <w:t>[Phân tích nguyên nhân]</w:t>
+              <w:t>Prompt ban đầu ghi chung chung, chưa giới hạn thư viện UI sử dụng.</w:t>
             </w:r>
           </w:p>
         </w:tc>
@@ -4374,7 +4285,23 @@
                 <w:sz w:val="24"/>
                 <w:szCs w:val="24"/>
               </w:rPr>
-              <w:t>[Bước đã làm để fix]</w:t>
+              <w:t xml:space="preserve">Tiến hành re-prompt, bổ sung điều kiện ràng buộc: </w:t>
+            </w:r>
+            <w:r>
+              <w:rPr>
+                <w:i/>
+                <w:iCs/>
+                <w:sz w:val="24"/>
+                <w:szCs w:val="24"/>
+              </w:rPr>
+              <w:t>"Thiết kế layout dạng lưới đơn giản tối giản theo phong cách React-Bootstrap"</w:t>
+            </w:r>
+            <w:r>
+              <w:rPr>
+                <w:sz w:val="24"/>
+                <w:szCs w:val="24"/>
+              </w:rPr>
+              <w:t>.</w:t>
             </w:r>
           </w:p>
         </w:tc>
@@ -4401,18 +4328,12 @@
                 <w:sz w:val="24"/>
                 <w:szCs w:val="24"/>
               </w:rPr>
-              <w:t>[Đã fix / Chưa fix]</w:t>
+              <w:t>Đã fix</w:t>
             </w:r>
           </w:p>
         </w:tc>
       </w:tr>
       <w:tr>
-        <w:tblPrEx>
-          <w:tblCellMar>
-            <w:top w:w="0" w:type="dxa"/>
-            <w:bottom w:w="0" w:type="dxa"/>
-          </w:tblCellMar>
-        </w:tblPrEx>
         <w:tc>
           <w:tcPr>
             <w:tcW w:w="400" w:type="dxa"/>
@@ -4463,7 +4384,7 @@
                 <w:sz w:val="24"/>
                 <w:szCs w:val="24"/>
               </w:rPr>
-              <w:t>[...]</w:t>
+              <w:t>Lỗi xung đột cổng (Port) khi chạy song song cả React và JSON-Server.</w:t>
             </w:r>
           </w:p>
         </w:tc>
@@ -4490,7 +4411,7 @@
                 <w:sz w:val="24"/>
                 <w:szCs w:val="24"/>
               </w:rPr>
-              <w:t>[...]</w:t>
+              <w:t>Cả hai công cụ đôi khi tự động cấu hình hoặc tranh chấp quyền ưu tiên cổng mạng nếu không chỉ định rõ.</w:t>
             </w:r>
           </w:p>
         </w:tc>
@@ -4517,7 +4438,7 @@
                 <w:sz w:val="24"/>
                 <w:szCs w:val="24"/>
               </w:rPr>
-              <w:t>[...]</w:t>
+              <w:t>Cấu hình script trong package.json ép buộc định danh cổng cụ thể: --port 3001 cho json-server và giữ 5173 cho Vite.</w:t>
             </w:r>
           </w:p>
         </w:tc>
@@ -4544,150 +4465,7 @@
                 <w:sz w:val="24"/>
                 <w:szCs w:val="24"/>
               </w:rPr>
-              <w:t>[...]</w:t>
-            </w:r>
-          </w:p>
-        </w:tc>
-      </w:tr>
-      <w:tr>
-        <w:tblPrEx>
-          <w:tblCellMar>
-            <w:top w:w="0" w:type="dxa"/>
-            <w:bottom w:w="0" w:type="dxa"/>
-          </w:tblCellMar>
-        </w:tblPrEx>
-        <w:tc>
-          <w:tcPr>
-            <w:tcW w:w="400" w:type="dxa"/>
-            <w:tcBorders>
-              <w:top w:val="single" w:sz="1" w:space="0" w:color="AAB7C4"/>
-              <w:left w:val="single" w:sz="1" w:space="0" w:color="AAB7C4"/>
-              <w:bottom w:val="single" w:sz="1" w:space="0" w:color="AAB7C4"/>
-              <w:right w:val="single" w:sz="1" w:space="0" w:color="AAB7C4"/>
-            </w:tcBorders>
-            <w:shd w:val="clear" w:color="auto" w:fill="F8F9FA"/>
-            <w:tcMar>
-              <w:top w:w="80" w:type="dxa"/>
-              <w:left w:w="120" w:type="dxa"/>
-              <w:bottom w:w="80" w:type="dxa"/>
-              <w:right w:w="120" w:type="dxa"/>
-            </w:tcMar>
-          </w:tcPr>
-          <w:p>
-            <w:r>
-              <w:rPr>
-                <w:sz w:val="24"/>
-                <w:szCs w:val="24"/>
-              </w:rPr>
-              <w:t>3</w:t>
-            </w:r>
-          </w:p>
-        </w:tc>
-        <w:tc>
-          <w:tcPr>
-            <w:tcW w:w="2500" w:type="dxa"/>
-            <w:tcBorders>
-              <w:top w:val="single" w:sz="1" w:space="0" w:color="AAB7C4"/>
-              <w:left w:val="single" w:sz="1" w:space="0" w:color="AAB7C4"/>
-              <w:bottom w:val="single" w:sz="1" w:space="0" w:color="AAB7C4"/>
-              <w:right w:val="single" w:sz="1" w:space="0" w:color="AAB7C4"/>
-            </w:tcBorders>
-            <w:shd w:val="clear" w:color="auto" w:fill="F8F9FA"/>
-            <w:tcMar>
-              <w:top w:w="80" w:type="dxa"/>
-              <w:left w:w="120" w:type="dxa"/>
-              <w:bottom w:w="80" w:type="dxa"/>
-              <w:right w:w="120" w:type="dxa"/>
-            </w:tcMar>
-          </w:tcPr>
-          <w:p>
-            <w:r>
-              <w:rPr>
-                <w:sz w:val="24"/>
-                <w:szCs w:val="24"/>
-              </w:rPr>
-              <w:t>[...]</w:t>
-            </w:r>
-          </w:p>
-        </w:tc>
-        <w:tc>
-          <w:tcPr>
-            <w:tcW w:w="2026" w:type="dxa"/>
-            <w:tcBorders>
-              <w:top w:val="single" w:sz="1" w:space="0" w:color="AAB7C4"/>
-              <w:left w:val="single" w:sz="1" w:space="0" w:color="AAB7C4"/>
-              <w:bottom w:val="single" w:sz="1" w:space="0" w:color="AAB7C4"/>
-              <w:right w:val="single" w:sz="1" w:space="0" w:color="AAB7C4"/>
-            </w:tcBorders>
-            <w:shd w:val="clear" w:color="auto" w:fill="F8F9FA"/>
-            <w:tcMar>
-              <w:top w:w="80" w:type="dxa"/>
-              <w:left w:w="120" w:type="dxa"/>
-              <w:bottom w:w="80" w:type="dxa"/>
-              <w:right w:w="120" w:type="dxa"/>
-            </w:tcMar>
-          </w:tcPr>
-          <w:p>
-            <w:r>
-              <w:rPr>
-                <w:sz w:val="24"/>
-                <w:szCs w:val="24"/>
-              </w:rPr>
-              <w:t>[...]</w:t>
-            </w:r>
-          </w:p>
-        </w:tc>
-        <w:tc>
-          <w:tcPr>
-            <w:tcW w:w="2100" w:type="dxa"/>
-            <w:tcBorders>
-              <w:top w:val="single" w:sz="1" w:space="0" w:color="AAB7C4"/>
-              <w:left w:val="single" w:sz="1" w:space="0" w:color="AAB7C4"/>
-              <w:bottom w:val="single" w:sz="1" w:space="0" w:color="AAB7C4"/>
-              <w:right w:val="single" w:sz="1" w:space="0" w:color="AAB7C4"/>
-            </w:tcBorders>
-            <w:shd w:val="clear" w:color="auto" w:fill="F8F9FA"/>
-            <w:tcMar>
-              <w:top w:w="80" w:type="dxa"/>
-              <w:left w:w="120" w:type="dxa"/>
-              <w:bottom w:w="80" w:type="dxa"/>
-              <w:right w:w="120" w:type="dxa"/>
-            </w:tcMar>
-          </w:tcPr>
-          <w:p>
-            <w:r>
-              <w:rPr>
-                <w:sz w:val="24"/>
-                <w:szCs w:val="24"/>
-              </w:rPr>
-              <w:t>[...]</w:t>
-            </w:r>
-          </w:p>
-        </w:tc>
-        <w:tc>
-          <w:tcPr>
-            <w:tcW w:w="2000" w:type="dxa"/>
-            <w:tcBorders>
-              <w:top w:val="single" w:sz="1" w:space="0" w:color="AAB7C4"/>
-              <w:left w:val="single" w:sz="1" w:space="0" w:color="AAB7C4"/>
-              <w:bottom w:val="single" w:sz="1" w:space="0" w:color="AAB7C4"/>
-              <w:right w:val="single" w:sz="1" w:space="0" w:color="AAB7C4"/>
-            </w:tcBorders>
-            <w:shd w:val="clear" w:color="auto" w:fill="F8F9FA"/>
-            <w:tcMar>
-              <w:top w:w="80" w:type="dxa"/>
-              <w:left w:w="120" w:type="dxa"/>
-              <w:bottom w:w="80" w:type="dxa"/>
-              <w:right w:w="120" w:type="dxa"/>
-            </w:tcMar>
-          </w:tcPr>
-          <w:p>
-            <w:r>
-              <w:rPr>
-                <w:sz w:val="24"/>
-                <w:szCs w:val="24"/>
-              </w:rPr>
-              <w:t>[...]</w:t>
+              <w:t>Đã fix</w:t>
             </w:r>
           </w:p>
         </w:tc>
@@ -4716,7 +4494,20 @@
         <w:spacing w:before="40" w:after="40"/>
       </w:pPr>
       <w:r>
-        <w:t>[Phần lý thuyết tuần này nhóm chưa nắm vững:]</w:t>
+        <w:rPr>
+          <w:b/>
+          <w:bCs/>
+        </w:rPr>
+        <w:t>Phần lý thuyết tuần này nhóm chưa nắm vững:</w:t>
+      </w:r>
+      <w:r>
+        <w:t xml:space="preserve"> Cách tổ chức tối ưu mối quan hệ cha-con (Parent-Child relation) trên sơ đồ Component Tree đối với các trang có tương tác động phức tạp như Form điền thông tin bệnh nhân.</w:t>
+      </w:r>
+      <w:r>
+        <w:t xml:space="preserve"> </w:t>
+      </w:r>
+      <w:r>
+        <w:t>[Tính năng nào chưa hoàn thiện, UI/UX còn thiếu sót:]</w:t>
       </w:r>
     </w:p>
     <w:p>
@@ -4729,7 +4520,14 @@
         <w:spacing w:before="40" w:after="40"/>
       </w:pPr>
       <w:r>
-        <w:t>[Tính năng nào chưa hoàn thiện, UI/UX còn thiếu sót:]</w:t>
+        <w:rPr>
+          <w:b/>
+          <w:bCs/>
+        </w:rPr>
+        <w:t>Tính năng nào chưa hoàn thiện, UI/UX còn thiếu sót:</w:t>
+      </w:r>
+      <w:r>
+        <w:t xml:space="preserve"> Bản vẽ thiết kế mockup do AI sinh ra ở một vài chi tiết nhỏ chưa được chuẩn hóa hoàn toàn theo hệ lưới Grid System của Bootstrap. Nhóm sẽ chủ động điều chỉnh bằng tay trong quá trình code thực tế ở Tuần 2 và Tuần 5.</w:t>
       </w:r>
     </w:p>
     <w:p>
@@ -4742,12 +4540,19 @@
         <w:spacing w:before="40" w:after="40"/>
       </w:pPr>
       <w:r>
-        <w:t>[Câu hỏi cần hỏi giảng viên trong buổi học tiếp theo:]</w:t>
+        <w:rPr>
+          <w:b/>
+          <w:bCs/>
+        </w:rPr>
+        <w:t>Câu hỏi cần hỏi giảng viên trong buổi học tiếp theo:</w:t>
+      </w:r>
+      <w:r>
+        <w:t xml:space="preserve"> Xin thầy/cô gợi ý thêm về cấu trúc dữ liệu db.json tối ưu cho phần quản lý ca khám (Time Slots: Sáng/Chiều) của Bác sĩ để thuận tiện cho việc xử lý State ở Tuần 4.</w:t>
       </w:r>
     </w:p>
     <w:sectPr>
-      <w:headerReference w:type="default" r:id="rId7"/>
-      <w:footerReference w:type="default" r:id="rId8"/>
+      <w:headerReference w:type="default" r:id="rId8"/>
+      <w:footerReference w:type="default" r:id="rId9"/>
       <w:pgSz w:w="11906" w:h="16838"/>
       <w:pgMar w:top="1134" w:right="850" w:bottom="1134" w:left="1701" w:header="708" w:footer="708" w:gutter="0"/>
       <w:cols w:space="720"/>
@@ -5762,6 +5567,11 @@
       <w:shd w:val="clear" w:color="auto" w:fill="E1DFDD"/>
     </w:rPr>
   </w:style>
+  <w:style w:type="character" w:customStyle="1" w:styleId="citation-1061">
+    <w:name w:val="citation-1061"/>
+    <w:basedOn w:val="DefaultParagraphFont"/>
+    <w:rsid w:val="0048429F"/>
+  </w:style>
 </w:styles>
 </file>
 

</xml_diff>